<commit_message>
revised LatLearn URL to my new Codeberg repo
</commit_message>
<xml_diff>
--- a/sw-eng-MikeKramlich.docx
+++ b/sw-eng-MikeKramlich.docx
@@ -23,7 +23,7 @@
         <w:pStyle w:val="Date"/>
       </w:pPr>
       <w:r>
-        <w:t xml:space="preserve">2024 Aug 30</w:t>
+        <w:t xml:space="preserve">2026 Jan 03</w:t>
       </w:r>
     </w:p>
     <w:bookmarkStart w:id="20" w:name="introduction"/>
@@ -691,7 +691,7 @@
           <w:rPr>
             <w:rStyle w:val="Hyperlink"/>
           </w:rPr>
-          <w:t xml:space="preserve">https://github.com/mkramlich/latlearn</w:t>
+          <w:t xml:space="preserve">https://codeberg.org/grogsynlog42/LatLearn</w:t>
         </w:r>
       </w:hyperlink>
     </w:p>
@@ -3774,7 +3774,7 @@
         <w:pStyle w:val="FirstParagraph"/>
       </w:pPr>
       <w:r>
-        <w:t xml:space="preserve">UPDATED: 2024 Aug 30</w:t>
+        <w:t xml:space="preserve">UPDATED: 2026 Jan 03</w:t>
       </w:r>
     </w:p>
     <w:bookmarkEnd w:id="78"/>

</xml_diff>

<commit_message>
Writing Online: deleted entry for CLIFMO; revised link for my old perf cheatsheet PDF to point at location in public GitHub repo
</commit_message>
<xml_diff>
--- a/sw-eng-MikeKramlich.docx
+++ b/sw-eng-MikeKramlich.docx
@@ -23,7 +23,7 @@
         <w:pStyle w:val="Date"/>
       </w:pPr>
       <w:r>
-        <w:t xml:space="preserve">2026 Jun 24</w:t>
+        <w:t xml:space="preserve">2026 Jun 29</w:t>
       </w:r>
     </w:p>
     <w:bookmarkStart w:id="20" w:name="introduction"/>
@@ -784,7 +784,7 @@
       </w:hyperlink>
     </w:p>
     <w:bookmarkEnd w:id="30"/>
-    <w:bookmarkStart w:id="36" w:name="writing-online"/>
+    <w:bookmarkStart w:id="35" w:name="writing-online"/>
     <w:p>
       <w:pPr>
         <w:pStyle w:val="Heading1"/>
@@ -841,7 +841,7 @@
           <w:rPr>
             <w:rStyle w:val="Hyperlink"/>
           </w:rPr>
-          <w:t xml:space="preserve">https://drive.google.com/file/d/1DsUG90gEkBtEsHJ7qJWR-VWLxHSTspcA/view</w:t>
+          <w:t xml:space="preserve">https://github.com/mkramlich/perfscalebook/blob/main/perf_scale_cheatsheet.pdf</w:t>
         </w:r>
       </w:hyperlink>
     </w:p>
@@ -857,38 +857,12 @@
           <w:iCs/>
           <w:i/>
         </w:rPr>
-        <w:t xml:space="preserve">CLIFMO: My Software Engineering Philosophy, Preferences and Practices</w:t>
+        <w:t xml:space="preserve">Video Calls Good and Bad</w:t>
       </w:r>
       <w:r>
         <w:br/>
       </w:r>
       <w:hyperlink r:id="rId33">
-        <w:r>
-          <w:rPr>
-            <w:rStyle w:val="Hyperlink"/>
-          </w:rPr>
-          <w:t xml:space="preserve">https://drive.google.com/file/d/1_zl1euz6sIhJ2VFonkaDS9grHNATBJfo/view?usp=sharing</w:t>
-        </w:r>
-      </w:hyperlink>
-    </w:p>
-    <w:p>
-      <w:pPr>
-        <w:numPr>
-          <w:ilvl w:val="0"/>
-          <w:numId w:val="1007"/>
-        </w:numPr>
-      </w:pPr>
-      <w:r>
-        <w:rPr>
-          <w:iCs/>
-          <w:i/>
-        </w:rPr>
-        <w:t xml:space="preserve">Video Calls Good and Bad</w:t>
-      </w:r>
-      <w:r>
-        <w:br/>
-      </w:r>
-      <w:hyperlink r:id="rId34">
         <w:r>
           <w:rPr>
             <w:rStyle w:val="Hyperlink"/>
@@ -914,7 +888,7 @@
       <w:r>
         <w:br/>
       </w:r>
-      <w:hyperlink r:id="rId35">
+      <w:hyperlink r:id="rId34">
         <w:r>
           <w:rPr>
             <w:rStyle w:val="Hyperlink"/>
@@ -923,8 +897,8 @@
         </w:r>
       </w:hyperlink>
     </w:p>
-    <w:bookmarkEnd w:id="36"/>
-    <w:bookmarkStart w:id="38" w:name="slideshows-presentations"/>
+    <w:bookmarkEnd w:id="35"/>
+    <w:bookmarkStart w:id="37" w:name="slideshows-presentations"/>
     <w:p>
       <w:pPr>
         <w:pStyle w:val="Heading1"/>
@@ -947,7 +921,7 @@
       <w:r>
         <w:br/>
       </w:r>
-      <w:hyperlink r:id="rId37">
+      <w:hyperlink r:id="rId36">
         <w:r>
           <w:rPr>
             <w:rStyle w:val="Hyperlink"/>
@@ -956,8 +930,8 @@
         </w:r>
       </w:hyperlink>
     </w:p>
-    <w:bookmarkEnd w:id="38"/>
-    <w:bookmarkStart w:id="42" w:name="screencasts"/>
+    <w:bookmarkEnd w:id="37"/>
+    <w:bookmarkStart w:id="41" w:name="screencasts"/>
     <w:p>
       <w:pPr>
         <w:pStyle w:val="Heading1"/>
@@ -991,7 +965,7 @@
       <w:r>
         <w:br/>
       </w:r>
-      <w:hyperlink r:id="rId39">
+      <w:hyperlink r:id="rId38">
         <w:r>
           <w:rPr>
             <w:rStyle w:val="Hyperlink"/>
@@ -1002,7 +976,7 @@
       <w:r>
         <w:br/>
       </w:r>
-      <w:hyperlink r:id="rId40">
+      <w:hyperlink r:id="rId39">
         <w:r>
           <w:rPr>
             <w:rStyle w:val="Hyperlink"/>
@@ -1024,7 +998,7 @@
       <w:r>
         <w:br/>
       </w:r>
-      <w:hyperlink r:id="rId41">
+      <w:hyperlink r:id="rId40">
         <w:r>
           <w:rPr>
             <w:rStyle w:val="Hyperlink"/>
@@ -1033,8 +1007,8 @@
         </w:r>
       </w:hyperlink>
     </w:p>
-    <w:bookmarkEnd w:id="42"/>
-    <w:bookmarkStart w:id="54" w:name="contract-work"/>
+    <w:bookmarkEnd w:id="41"/>
+    <w:bookmarkStart w:id="53" w:name="contract-work"/>
     <w:p>
       <w:pPr>
         <w:pStyle w:val="Heading1"/>
@@ -1108,7 +1082,7 @@
                     </pic:cNvPicPr>
                   </pic:nvPicPr>
                   <pic:blipFill>
-                    <a:blip r:embed="rId43"/>
+                    <a:blip r:embed="rId42"/>
                     <a:stretch>
                       <a:fillRect/>
                     </a:stretch>
@@ -1244,7 +1218,7 @@
       <w:r>
         <w:br/>
       </w:r>
-      <w:hyperlink r:id="rId44">
+      <w:hyperlink r:id="rId43">
         <w:r>
           <w:rPr>
             <w:rStyle w:val="Hyperlink"/>
@@ -1255,7 +1229,7 @@
       <w:r>
         <w:br/>
       </w:r>
-      <w:hyperlink r:id="rId45">
+      <w:hyperlink r:id="rId44">
         <w:r>
           <w:rPr>
             <w:rStyle w:val="Hyperlink"/>
@@ -1266,7 +1240,7 @@
       <w:r>
         <w:br/>
       </w:r>
-      <w:hyperlink r:id="rId46">
+      <w:hyperlink r:id="rId45">
         <w:r>
           <w:rPr>
             <w:rStyle w:val="Hyperlink"/>
@@ -1277,7 +1251,7 @@
       <w:r>
         <w:br/>
       </w:r>
-      <w:hyperlink r:id="rId47">
+      <w:hyperlink r:id="rId46">
         <w:r>
           <w:rPr>
             <w:rStyle w:val="Hyperlink"/>
@@ -1356,7 +1330,7 @@
                     </pic:cNvPicPr>
                   </pic:nvPicPr>
                   <pic:blipFill>
-                    <a:blip r:embed="rId48"/>
+                    <a:blip r:embed="rId47"/>
                     <a:stretch>
                       <a:fillRect/>
                     </a:stretch>
@@ -1413,6 +1387,68 @@
                 <pic:pic>
                   <pic:nvPicPr>
                     <pic:cNvPr descr="./sshots/fp_main.png" id="0" name="Picture"/>
+                    <pic:cNvPicPr>
+                      <a:picLocks noChangeArrowheads="1" noChangeAspect="1"/>
+                    </pic:cNvPicPr>
+                  </pic:nvPicPr>
+                  <pic:blipFill>
+                    <a:blip r:embed="rId48"/>
+                    <a:stretch>
+                      <a:fillRect/>
+                    </a:stretch>
+                  </pic:blipFill>
+                  <pic:spPr bwMode="auto">
+                    <a:xfrm>
+                      <a:off x="0" y="0"/>
+                      <a:ext cx="4902200" cy="9423400"/>
+                    </a:xfrm>
+                    <a:prstGeom prst="rect">
+                      <a:avLst/>
+                    </a:prstGeom>
+                    <a:noFill/>
+                    <a:ln w="9525">
+                      <a:noFill/>
+                      <a:headEnd/>
+                      <a:tailEnd/>
+                    </a:ln>
+                  </pic:spPr>
+                </pic:pic>
+              </a:graphicData>
+            </a:graphic>
+          </wp:inline>
+        </w:drawing>
+      </w:r>
+    </w:p>
+    <w:p>
+      <w:pPr>
+        <w:numPr>
+          <w:ilvl w:val="0"/>
+          <w:numId w:val="1010"/>
+        </w:numPr>
+      </w:pPr>
+      <w:r>
+        <w:t xml:space="preserve">technical architect and sole programmer of a company’s first iOS app, as a direct contractor. The app I made was a slick-looking, location-aware mobile front-end to their deal-finding service (think: coupons and promotions by restaurants and clothing stores in NYC.) I completed it successfully and we shipped to the App Store, and it went live on sale. Featured on television on CBS and NBC, and in the New York Times. The actual iOS app I made was demonstrated live in a video segment. Pretty exciting to see code that I wrote and shipped being used on screen on a major public TV network. I worked with and reported directly to their original co-founding CTO, who himself wrote all/most of their original backend in Lisp. He also built a public RESTful HTTP JSON service which I then made the iOS app communicate with, in order to submit and find deals to display. Sometime later their company gained more investment, including Google Ventures, shifted their feature/domain a little, and rebranded, and were still going strong as of 2016.</w:t>
+      </w:r>
+      <w:r>
+        <w:br/>
+      </w:r>
+      <w:r>
+        <w:t xml:space="preserve">tech: iOS SDK/API, Objective-C, CocoaTouch, XCode, Gimp, bash, JSON, HTTP, geolocation, maps</w:t>
+      </w:r>
+      <w:r>
+        <w:br/>
+      </w:r>
+      <w:r>
+        <w:drawing>
+          <wp:inline>
+            <wp:extent cx="4902200" cy="9423400"/>
+            <wp:effectExtent b="0" l="0" r="0" t="0"/>
+            <wp:docPr descr="" title="" id="1" name="Picture"/>
+            <a:graphic>
+              <a:graphicData uri="http://schemas.openxmlformats.org/drawingml/2006/picture">
+                <pic:pic>
+                  <pic:nvPicPr>
+                    <pic:cNvPr descr="./sshots/pbon_nearby_in_map_mode.png" id="0" name="Picture"/>
                     <pic:cNvPicPr>
                       <a:picLocks noChangeArrowheads="1" noChangeAspect="1"/>
                     </pic:cNvPicPr>
@@ -1453,68 +1489,6 @@
         </w:numPr>
       </w:pPr>
       <w:r>
-        <w:t xml:space="preserve">technical architect and sole programmer of a company’s first iOS app, as a direct contractor. The app I made was a slick-looking, location-aware mobile front-end to their deal-finding service (think: coupons and promotions by restaurants and clothing stores in NYC.) I completed it successfully and we shipped to the App Store, and it went live on sale. Featured on television on CBS and NBC, and in the New York Times. The actual iOS app I made was demonstrated live in a video segment. Pretty exciting to see code that I wrote and shipped being used on screen on a major public TV network. I worked with and reported directly to their original co-founding CTO, who himself wrote all/most of their original backend in Lisp. He also built a public RESTful HTTP JSON service which I then made the iOS app communicate with, in order to submit and find deals to display. Sometime later their company gained more investment, including Google Ventures, shifted their feature/domain a little, and rebranded, and were still going strong as of 2016.</w:t>
-      </w:r>
-      <w:r>
-        <w:br/>
-      </w:r>
-      <w:r>
-        <w:t xml:space="preserve">tech: iOS SDK/API, Objective-C, CocoaTouch, XCode, Gimp, bash, JSON, HTTP, geolocation, maps</w:t>
-      </w:r>
-      <w:r>
-        <w:br/>
-      </w:r>
-      <w:r>
-        <w:drawing>
-          <wp:inline>
-            <wp:extent cx="4902200" cy="9423400"/>
-            <wp:effectExtent b="0" l="0" r="0" t="0"/>
-            <wp:docPr descr="" title="" id="1" name="Picture"/>
-            <a:graphic>
-              <a:graphicData uri="http://schemas.openxmlformats.org/drawingml/2006/picture">
-                <pic:pic>
-                  <pic:nvPicPr>
-                    <pic:cNvPr descr="./sshots/pbon_nearby_in_map_mode.png" id="0" name="Picture"/>
-                    <pic:cNvPicPr>
-                      <a:picLocks noChangeArrowheads="1" noChangeAspect="1"/>
-                    </pic:cNvPicPr>
-                  </pic:nvPicPr>
-                  <pic:blipFill>
-                    <a:blip r:embed="rId50"/>
-                    <a:stretch>
-                      <a:fillRect/>
-                    </a:stretch>
-                  </pic:blipFill>
-                  <pic:spPr bwMode="auto">
-                    <a:xfrm>
-                      <a:off x="0" y="0"/>
-                      <a:ext cx="4902200" cy="9423400"/>
-                    </a:xfrm>
-                    <a:prstGeom prst="rect">
-                      <a:avLst/>
-                    </a:prstGeom>
-                    <a:noFill/>
-                    <a:ln w="9525">
-                      <a:noFill/>
-                      <a:headEnd/>
-                      <a:tailEnd/>
-                    </a:ln>
-                  </pic:spPr>
-                </pic:pic>
-              </a:graphicData>
-            </a:graphic>
-          </wp:inline>
-        </w:drawing>
-      </w:r>
-    </w:p>
-    <w:p>
-      <w:pPr>
-        <w:numPr>
-          <w:ilvl w:val="0"/>
-          <w:numId w:val="1010"/>
-        </w:numPr>
-      </w:pPr>
-      <w:r>
         <w:t xml:space="preserve">made a retro 2D adventure game (in the spirit and UX mechanics of Leisure Suit Larry), for a client in the ad industry, about a guy, his house, and the adventures he gets up to one enchanted evening. Contractor for an adver-gaming company who in turn did it for a major worldwide food conglomerate. with the purpose of promoting one of their ice cream products. which was featured in the game itself. I was the technical architect of this iOS app and did all its programming, including the technical design of a new script-driven game engine, and some helper tools (in Python and bash.) Someone else devised the game’s</w:t>
       </w:r>
       <w:r>
@@ -1560,7 +1534,7 @@
                     </pic:cNvPicPr>
                   </pic:nvPicPr>
                   <pic:blipFill>
-                    <a:blip r:embed="rId51"/>
+                    <a:blip r:embed="rId50"/>
                     <a:stretch>
                       <a:fillRect/>
                     </a:stretch>
@@ -1639,7 +1613,7 @@
       <w:r>
         <w:br/>
       </w:r>
-      <w:hyperlink r:id="rId52">
+      <w:hyperlink r:id="rId51">
         <w:r>
           <w:rPr>
             <w:rStyle w:val="Hyperlink"/>
@@ -1666,7 +1640,7 @@
                     </pic:cNvPicPr>
                   </pic:nvPicPr>
                   <pic:blipFill>
-                    <a:blip r:embed="rId53"/>
+                    <a:blip r:embed="rId52"/>
                     <a:stretch>
                       <a:fillRect/>
                     </a:stretch>
@@ -1728,8 +1702,8 @@
         <w:t xml:space="preserve">tech: C++, Java, CORBA, DCOM, 3270, xBOI, Visual C++ 5, UML, Toad, Java AWT/Swing, Solaris</w:t>
       </w:r>
     </w:p>
-    <w:bookmarkEnd w:id="54"/>
-    <w:bookmarkStart w:id="74" w:name="personal-projects"/>
+    <w:bookmarkEnd w:id="53"/>
+    <w:bookmarkStart w:id="73" w:name="personal-projects"/>
     <w:p>
       <w:pPr>
         <w:pStyle w:val="Heading1"/>
@@ -1806,7 +1780,7 @@
       <w:r>
         <w:t xml:space="preserve"> </w:t>
       </w:r>
-      <w:hyperlink r:id="rId55">
+      <w:hyperlink r:id="rId54">
         <w:r>
           <w:rPr>
             <w:rStyle w:val="Hyperlink"/>
@@ -1833,7 +1807,7 @@
                     </pic:cNvPicPr>
                   </pic:nvPicPr>
                   <pic:blipFill>
-                    <a:blip r:embed="rId56"/>
+                    <a:blip r:embed="rId55"/>
                     <a:stretch>
                       <a:fillRect/>
                     </a:stretch>
@@ -1895,7 +1869,7 @@
       <w:r>
         <w:t xml:space="preserve"> </w:t>
       </w:r>
-      <w:hyperlink r:id="rId57">
+      <w:hyperlink r:id="rId56">
         <w:r>
           <w:rPr>
             <w:rStyle w:val="Hyperlink"/>
@@ -2011,7 +1985,7 @@
       <w:r>
         <w:br/>
       </w:r>
-      <w:hyperlink r:id="rId58">
+      <w:hyperlink r:id="rId57">
         <w:r>
           <w:rPr>
             <w:rStyle w:val="Hyperlink"/>
@@ -2022,7 +1996,7 @@
       <w:r>
         <w:br/>
       </w:r>
-      <w:hyperlink r:id="rId59">
+      <w:hyperlink r:id="rId58">
         <w:r>
           <w:rPr>
             <w:rStyle w:val="Hyperlink"/>
@@ -2049,7 +2023,7 @@
                     </pic:cNvPicPr>
                   </pic:nvPicPr>
                   <pic:blipFill>
-                    <a:blip r:embed="rId60"/>
+                    <a:blip r:embed="rId59"/>
                     <a:stretch>
                       <a:fillRect/>
                     </a:stretch>
@@ -2094,7 +2068,7 @@
                     </pic:cNvPicPr>
                   </pic:nvPicPr>
                   <pic:blipFill>
-                    <a:blip r:embed="rId61"/>
+                    <a:blip r:embed="rId60"/>
                     <a:stretch>
                       <a:fillRect/>
                     </a:stretch>
@@ -2156,7 +2130,7 @@
       <w:r>
         <w:t xml:space="preserve"> </w:t>
       </w:r>
-      <w:hyperlink r:id="rId62">
+      <w:hyperlink r:id="rId61">
         <w:r>
           <w:rPr>
             <w:rStyle w:val="Hyperlink"/>
@@ -2183,7 +2157,7 @@
                     </pic:cNvPicPr>
                   </pic:nvPicPr>
                   <pic:blipFill>
-                    <a:blip r:embed="rId63"/>
+                    <a:blip r:embed="rId62"/>
                     <a:stretch>
                       <a:fillRect/>
                     </a:stretch>
@@ -2228,7 +2202,7 @@
                     </pic:cNvPicPr>
                   </pic:nvPicPr>
                   <pic:blipFill>
-                    <a:blip r:embed="rId64"/>
+                    <a:blip r:embed="rId63"/>
                     <a:stretch>
                       <a:fillRect/>
                     </a:stretch>
@@ -2263,7 +2237,7 @@
       <w:r>
         <w:t xml:space="preserve"> </w:t>
       </w:r>
-      <w:hyperlink r:id="rId65">
+      <w:hyperlink r:id="rId64">
         <w:r>
           <w:rPr>
             <w:rStyle w:val="Hyperlink"/>
@@ -2307,7 +2281,7 @@
       <w:r>
         <w:t xml:space="preserve"> </w:t>
       </w:r>
-      <w:hyperlink r:id="rId66">
+      <w:hyperlink r:id="rId65">
         <w:r>
           <w:rPr>
             <w:rStyle w:val="Hyperlink"/>
@@ -2334,7 +2308,7 @@
                     </pic:cNvPicPr>
                   </pic:nvPicPr>
                   <pic:blipFill>
-                    <a:blip r:embed="rId67"/>
+                    <a:blip r:embed="rId66"/>
                     <a:stretch>
                       <a:fillRect/>
                     </a:stretch>
@@ -2468,7 +2442,7 @@
       <w:r>
         <w:t xml:space="preserve"> </w:t>
       </w:r>
-      <w:hyperlink r:id="rId68">
+      <w:hyperlink r:id="rId67">
         <w:r>
           <w:rPr>
             <w:rStyle w:val="Hyperlink"/>
@@ -2512,7 +2486,7 @@
       <w:r>
         <w:t xml:space="preserve"> </w:t>
       </w:r>
-      <w:hyperlink r:id="rId69">
+      <w:hyperlink r:id="rId68">
         <w:r>
           <w:rPr>
             <w:rStyle w:val="Hyperlink"/>
@@ -2746,7 +2720,7 @@
                     </pic:cNvPicPr>
                   </pic:nvPicPr>
                   <pic:blipFill>
-                    <a:blip r:embed="rId70"/>
+                    <a:blip r:embed="rId69"/>
                     <a:stretch>
                       <a:fillRect/>
                     </a:stretch>
@@ -2786,6 +2760,51 @@
                 <pic:pic>
                   <pic:nvPicPr>
                     <pic:cNvPr descr="./sshots/wc_sshot_map.png" id="0" name="Picture"/>
+                    <pic:cNvPicPr>
+                      <a:picLocks noChangeArrowheads="1" noChangeAspect="1"/>
+                    </pic:cNvPicPr>
+                  </pic:nvPicPr>
+                  <pic:blipFill>
+                    <a:blip r:embed="rId70"/>
+                    <a:stretch>
+                      <a:fillRect/>
+                    </a:stretch>
+                  </pic:blipFill>
+                  <pic:spPr bwMode="auto">
+                    <a:xfrm>
+                      <a:off x="0" y="0"/>
+                      <a:ext cx="5334000" cy="4148666"/>
+                    </a:xfrm>
+                    <a:prstGeom prst="rect">
+                      <a:avLst/>
+                    </a:prstGeom>
+                    <a:noFill/>
+                    <a:ln w="9525">
+                      <a:noFill/>
+                      <a:headEnd/>
+                      <a:tailEnd/>
+                    </a:ln>
+                  </pic:spPr>
+                </pic:pic>
+              </a:graphicData>
+            </a:graphic>
+          </wp:inline>
+        </w:drawing>
+      </w:r>
+      <w:r>
+        <w:br/>
+      </w:r>
+      <w:r>
+        <w:drawing>
+          <wp:inline>
+            <wp:extent cx="5334000" cy="4148666"/>
+            <wp:effectExtent b="0" l="0" r="0" t="0"/>
+            <wp:docPr descr="game play, status tables" title="" id="1" name="Picture"/>
+            <a:graphic>
+              <a:graphicData uri="http://schemas.openxmlformats.org/drawingml/2006/picture">
+                <pic:pic>
+                  <pic:nvPicPr>
+                    <pic:cNvPr descr="./sshots/wc_sshot_status_tables.png" id="0" name="Picture"/>
                     <pic:cNvPicPr>
                       <a:picLocks noChangeArrowheads="1" noChangeAspect="1"/>
                     </pic:cNvPicPr>
@@ -2817,51 +2836,6 @@
           </wp:inline>
         </w:drawing>
       </w:r>
-      <w:r>
-        <w:br/>
-      </w:r>
-      <w:r>
-        <w:drawing>
-          <wp:inline>
-            <wp:extent cx="5334000" cy="4148666"/>
-            <wp:effectExtent b="0" l="0" r="0" t="0"/>
-            <wp:docPr descr="game play, status tables" title="" id="1" name="Picture"/>
-            <a:graphic>
-              <a:graphicData uri="http://schemas.openxmlformats.org/drawingml/2006/picture">
-                <pic:pic>
-                  <pic:nvPicPr>
-                    <pic:cNvPr descr="./sshots/wc_sshot_status_tables.png" id="0" name="Picture"/>
-                    <pic:cNvPicPr>
-                      <a:picLocks noChangeArrowheads="1" noChangeAspect="1"/>
-                    </pic:cNvPicPr>
-                  </pic:nvPicPr>
-                  <pic:blipFill>
-                    <a:blip r:embed="rId72"/>
-                    <a:stretch>
-                      <a:fillRect/>
-                    </a:stretch>
-                  </pic:blipFill>
-                  <pic:spPr bwMode="auto">
-                    <a:xfrm>
-                      <a:off x="0" y="0"/>
-                      <a:ext cx="5334000" cy="4148666"/>
-                    </a:xfrm>
-                    <a:prstGeom prst="rect">
-                      <a:avLst/>
-                    </a:prstGeom>
-                    <a:noFill/>
-                    <a:ln w="9525">
-                      <a:noFill/>
-                      <a:headEnd/>
-                      <a:tailEnd/>
-                    </a:ln>
-                  </pic:spPr>
-                </pic:pic>
-              </a:graphicData>
-            </a:graphic>
-          </wp:inline>
-        </w:drawing>
-      </w:r>
     </w:p>
     <w:p>
       <w:pPr>
@@ -2926,7 +2900,7 @@
                     </pic:cNvPicPr>
                   </pic:nvPicPr>
                   <pic:blipFill>
-                    <a:blip r:embed="rId73"/>
+                    <a:blip r:embed="rId72"/>
                     <a:stretch>
                       <a:fillRect/>
                     </a:stretch>
@@ -3034,219 +3008,219 @@
         <w:t xml:space="preserve">tech: Nginx, Django, Python, MySQL, PayPal, shell, Flash, ActionScript, JavaScript (JS), HTML, HTTP, DNS, Linux</w:t>
       </w:r>
     </w:p>
+    <w:bookmarkEnd w:id="73"/>
+    <w:bookmarkStart w:id="74" w:name="testimonials"/>
+    <w:p>
+      <w:pPr>
+        <w:pStyle w:val="Heading1"/>
+      </w:pPr>
+      <w:r>
+        <w:t xml:space="preserve">Testimonials</w:t>
+      </w:r>
+    </w:p>
+    <w:p>
+      <w:pPr>
+        <w:numPr>
+          <w:ilvl w:val="0"/>
+          <w:numId w:val="1012"/>
+        </w:numPr>
+      </w:pPr>
+      <w:r>
+        <w:t xml:space="preserve">“</w:t>
+      </w:r>
+      <w:r>
+        <w:t xml:space="preserve">Mike was a highly valued member of my software engineering team at CheapTickets. Given his deep technical knowledge and expertise coupled with a great skill to analyze and solve problems, I threw the most intractable problems at Mike. He left no stone unturned as he worked through and solved every problem thrown his way. Mike delivered outstanding code for the CheapTickets platform with an eye towards ensuring the best user experience possible.</w:t>
+      </w:r>
+      <w:r>
+        <w:t xml:space="preserve">”</w:t>
+      </w:r>
+    </w:p>
+    <w:p>
+      <w:pPr>
+        <w:numPr>
+          <w:ilvl w:val="0"/>
+          <w:numId w:val="1012"/>
+        </w:numPr>
+      </w:pPr>
+      <w:r>
+        <w:t xml:space="preserve">“</w:t>
+      </w:r>
+      <w:r>
+        <w:t xml:space="preserve">I have been very fortunate to work with and learn from many smart people in my career and Mike is one of them. My favorite collaboration with Mike was deploying DataPower’s XA35 module into the Cheaptickets environment… he was representing Dev and I Ops. A very smooth and successful project. Sped up our transformations considerably and we were able to repurpose or retire a majority of our front end servers.</w:t>
+      </w:r>
+      <w:r>
+        <w:t xml:space="preserve">”</w:t>
+      </w:r>
+    </w:p>
+    <w:p>
+      <w:pPr>
+        <w:numPr>
+          <w:ilvl w:val="0"/>
+          <w:numId w:val="1012"/>
+        </w:numPr>
+      </w:pPr>
+      <w:r>
+        <w:t xml:space="preserve">“</w:t>
+      </w:r>
+      <w:r>
+        <w:t xml:space="preserve">I worked with Michael during our time at Cheaptickets and I was really impressed with his quality of work and skills. Michael is not only a great technologist, but also very easy to work [with]; he makes challenging projects much easier to tackle. His intelligence and vision was always a big advantage on any project we worked together. I would recommend Michael emphatically.</w:t>
+      </w:r>
+      <w:r>
+        <w:t xml:space="preserve">”</w:t>
+      </w:r>
+    </w:p>
+    <w:p>
+      <w:pPr>
+        <w:numPr>
+          <w:ilvl w:val="0"/>
+          <w:numId w:val="1012"/>
+        </w:numPr>
+      </w:pPr>
+      <w:r>
+        <w:t xml:space="preserve">“</w:t>
+      </w:r>
+      <w:r>
+        <w:t xml:space="preserve">I worked directly with Michael on a very large iOS project, and he both managed, and directed the project very well. The project was very demanding, and Michael coordinated and led the project in a very professional manner. Michael is a developer who will get things done. I would be honored to work with him again.</w:t>
+      </w:r>
+      <w:r>
+        <w:t xml:space="preserve">”</w:t>
+      </w:r>
+    </w:p>
+    <w:p>
+      <w:pPr>
+        <w:numPr>
+          <w:ilvl w:val="0"/>
+          <w:numId w:val="1012"/>
+        </w:numPr>
+      </w:pPr>
+      <w:r>
+        <w:t xml:space="preserve">“</w:t>
+      </w:r>
+      <w:r>
+        <w:t xml:space="preserve">Michael is an excellent engineer with experience in a wide variety of platforms and software languages. He is a self motivated individual who is capable of getting up to speed on new systems quickly and delivering quality code in a timely manner.</w:t>
+      </w:r>
+      <w:r>
+        <w:t xml:space="preserve">”</w:t>
+      </w:r>
+    </w:p>
+    <w:p>
+      <w:pPr>
+        <w:numPr>
+          <w:ilvl w:val="0"/>
+          <w:numId w:val="1012"/>
+        </w:numPr>
+      </w:pPr>
+      <w:r>
+        <w:t xml:space="preserve">“</w:t>
+      </w:r>
+      <w:r>
+        <w:t xml:space="preserve">Mike created a high quality, stable iPhone app that met our specifications.</w:t>
+      </w:r>
+      <w:r>
+        <w:t xml:space="preserve">”</w:t>
+      </w:r>
+    </w:p>
+    <w:p>
+      <w:pPr>
+        <w:numPr>
+          <w:ilvl w:val="0"/>
+          <w:numId w:val="1012"/>
+        </w:numPr>
+      </w:pPr>
+      <w:r>
+        <w:t xml:space="preserve">“</w:t>
+      </w:r>
+      <w:r>
+        <w:t xml:space="preserve">I worked with Michael Kramlich when I was the director of software engineering at BlockDot. Michael was the lead delivery engineer for Blockdot’s Khaki Pants Pete iOS app. Working with Michael was absolutely fantastic! He is an excellent engineer, has a great</w:t>
+      </w:r>
+      <w:r>
+        <w:t xml:space="preserve"> </w:t>
+      </w:r>
+      <w:r>
+        <w:t xml:space="preserve">‘</w:t>
+      </w:r>
+      <w:r>
+        <w:t xml:space="preserve">get it done</w:t>
+      </w:r>
+      <w:r>
+        <w:t xml:space="preserve">’</w:t>
+      </w:r>
+      <w:r>
+        <w:t xml:space="preserve"> </w:t>
+      </w:r>
+      <w:r>
+        <w:t xml:space="preserve">drive to ship code, and goes above and beyond in making smart decisions that save time and improve the app experience. A perfect example of this is Michael’s initiative to take the original Khaki Pants Pete spec and see the opportunity to make the underlying iOS game engine more generic and flexible via a data-driven XML game file format that made adjusting the game play, settings, actions and visual experience very easy. This single innovation allowed us to ship on time with a great experience despite the multitude of late</w:t>
+      </w:r>
+      <w:r>
+        <w:t xml:space="preserve"> </w:t>
+      </w:r>
+      <w:r>
+        <w:t xml:space="preserve">‘</w:t>
+      </w:r>
+      <w:r>
+        <w:t xml:space="preserve">change requests</w:t>
+      </w:r>
+      <w:r>
+        <w:t xml:space="preserve">’</w:t>
+      </w:r>
+      <w:r>
+        <w:t xml:space="preserve"> </w:t>
+      </w:r>
+      <w:r>
+        <w:t xml:space="preserve">from the customer that so often occur in our industry. I can’t wait to work with him again!</w:t>
+      </w:r>
+      <w:r>
+        <w:t xml:space="preserve">”</w:t>
+      </w:r>
+    </w:p>
+    <w:p>
+      <w:pPr>
+        <w:numPr>
+          <w:ilvl w:val="0"/>
+          <w:numId w:val="1012"/>
+        </w:numPr>
+      </w:pPr>
+      <w:r>
+        <w:t xml:space="preserve">“</w:t>
+      </w:r>
+      <w:r>
+        <w:t xml:space="preserve">Also, in keeping with Mike Kramlich’s design goal of keeping the game simple and focused on the combat, you don’t design your ships a la Space Empires IV or develop your technology tees as per Master of Orion, Reach for the Stars, and Space Empires IV. You collect money, you build ships, you move, and you have combat. It’s pretty simple in execution—more chess than Sid Meier’s Civilization. It is more like the table-top marble game Albedo than Othello or Go. Movement is important, but it is restricted enough that grand flanking movements aren’t likely. If you can maintain your front lines and make sure you have enough reserves to cover a potential breakthrough, you can keep pushing forward by taking a few systems each turn.</w:t>
+      </w:r>
+      <w:r>
+        <w:t xml:space="preserve">”</w:t>
+      </w:r>
+      <w:r>
+        <w:t xml:space="preserve"> </w:t>
+      </w:r>
+      <w:r>
+        <w:t xml:space="preserve">– by Johnny Wilson (ex editor of Computer Gaming World), in his preview of my game Shattered Stars, back when I ran ZodLogic Games and he was part of Manifesto Games</w:t>
+      </w:r>
+    </w:p>
+    <w:p>
+      <w:pPr>
+        <w:numPr>
+          <w:ilvl w:val="0"/>
+          <w:numId w:val="1012"/>
+        </w:numPr>
+      </w:pPr>
+      <w:r>
+        <w:t xml:space="preserve">“</w:t>
+      </w:r>
+      <w:r>
+        <w:t xml:space="preserve">Badass! Great job</w:t>
+      </w:r>
+      <w:r>
+        <w:t xml:space="preserve">”</w:t>
+      </w:r>
+      <w:r>
+        <w:t xml:space="preserve"> </w:t>
+      </w:r>
+      <w:r>
+        <w:t xml:space="preserve">- a founding CEO in EV recharging industry</w:t>
+      </w:r>
+    </w:p>
     <w:bookmarkEnd w:id="74"/>
-    <w:bookmarkStart w:id="75" w:name="testimonials"/>
-    <w:p>
-      <w:pPr>
-        <w:pStyle w:val="Heading1"/>
-      </w:pPr>
-      <w:r>
-        <w:t xml:space="preserve">Testimonials</w:t>
-      </w:r>
-    </w:p>
-    <w:p>
-      <w:pPr>
-        <w:numPr>
-          <w:ilvl w:val="0"/>
-          <w:numId w:val="1012"/>
-        </w:numPr>
-      </w:pPr>
-      <w:r>
-        <w:t xml:space="preserve">“</w:t>
-      </w:r>
-      <w:r>
-        <w:t xml:space="preserve">Mike was a highly valued member of my software engineering team at CheapTickets. Given his deep technical knowledge and expertise coupled with a great skill to analyze and solve problems, I threw the most intractable problems at Mike. He left no stone unturned as he worked through and solved every problem thrown his way. Mike delivered outstanding code for the CheapTickets platform with an eye towards ensuring the best user experience possible.</w:t>
-      </w:r>
-      <w:r>
-        <w:t xml:space="preserve">”</w:t>
-      </w:r>
-    </w:p>
-    <w:p>
-      <w:pPr>
-        <w:numPr>
-          <w:ilvl w:val="0"/>
-          <w:numId w:val="1012"/>
-        </w:numPr>
-      </w:pPr>
-      <w:r>
-        <w:t xml:space="preserve">“</w:t>
-      </w:r>
-      <w:r>
-        <w:t xml:space="preserve">I have been very fortunate to work with and learn from many smart people in my career and Mike is one of them. My favorite collaboration with Mike was deploying DataPower’s XA35 module into the Cheaptickets environment… he was representing Dev and I Ops. A very smooth and successful project. Sped up our transformations considerably and we were able to repurpose or retire a majority of our front end servers.</w:t>
-      </w:r>
-      <w:r>
-        <w:t xml:space="preserve">”</w:t>
-      </w:r>
-    </w:p>
-    <w:p>
-      <w:pPr>
-        <w:numPr>
-          <w:ilvl w:val="0"/>
-          <w:numId w:val="1012"/>
-        </w:numPr>
-      </w:pPr>
-      <w:r>
-        <w:t xml:space="preserve">“</w:t>
-      </w:r>
-      <w:r>
-        <w:t xml:space="preserve">I worked with Michael during our time at Cheaptickets and I was really impressed with his quality of work and skills. Michael is not only a great technologist, but also very easy to work [with]; he makes challenging projects much easier to tackle. His intelligence and vision was always a big advantage on any project we worked together. I would recommend Michael emphatically.</w:t>
-      </w:r>
-      <w:r>
-        <w:t xml:space="preserve">”</w:t>
-      </w:r>
-    </w:p>
-    <w:p>
-      <w:pPr>
-        <w:numPr>
-          <w:ilvl w:val="0"/>
-          <w:numId w:val="1012"/>
-        </w:numPr>
-      </w:pPr>
-      <w:r>
-        <w:t xml:space="preserve">“</w:t>
-      </w:r>
-      <w:r>
-        <w:t xml:space="preserve">I worked directly with Michael on a very large iOS project, and he both managed, and directed the project very well. The project was very demanding, and Michael coordinated and led the project in a very professional manner. Michael is a developer who will get things done. I would be honored to work with him again.</w:t>
-      </w:r>
-      <w:r>
-        <w:t xml:space="preserve">”</w:t>
-      </w:r>
-    </w:p>
-    <w:p>
-      <w:pPr>
-        <w:numPr>
-          <w:ilvl w:val="0"/>
-          <w:numId w:val="1012"/>
-        </w:numPr>
-      </w:pPr>
-      <w:r>
-        <w:t xml:space="preserve">“</w:t>
-      </w:r>
-      <w:r>
-        <w:t xml:space="preserve">Michael is an excellent engineer with experience in a wide variety of platforms and software languages. He is a self motivated individual who is capable of getting up to speed on new systems quickly and delivering quality code in a timely manner.</w:t>
-      </w:r>
-      <w:r>
-        <w:t xml:space="preserve">”</w:t>
-      </w:r>
-    </w:p>
-    <w:p>
-      <w:pPr>
-        <w:numPr>
-          <w:ilvl w:val="0"/>
-          <w:numId w:val="1012"/>
-        </w:numPr>
-      </w:pPr>
-      <w:r>
-        <w:t xml:space="preserve">“</w:t>
-      </w:r>
-      <w:r>
-        <w:t xml:space="preserve">Mike created a high quality, stable iPhone app that met our specifications.</w:t>
-      </w:r>
-      <w:r>
-        <w:t xml:space="preserve">”</w:t>
-      </w:r>
-    </w:p>
-    <w:p>
-      <w:pPr>
-        <w:numPr>
-          <w:ilvl w:val="0"/>
-          <w:numId w:val="1012"/>
-        </w:numPr>
-      </w:pPr>
-      <w:r>
-        <w:t xml:space="preserve">“</w:t>
-      </w:r>
-      <w:r>
-        <w:t xml:space="preserve">I worked with Michael Kramlich when I was the director of software engineering at BlockDot. Michael was the lead delivery engineer for Blockdot’s Khaki Pants Pete iOS app. Working with Michael was absolutely fantastic! He is an excellent engineer, has a great</w:t>
-      </w:r>
-      <w:r>
-        <w:t xml:space="preserve"> </w:t>
-      </w:r>
-      <w:r>
-        <w:t xml:space="preserve">‘</w:t>
-      </w:r>
-      <w:r>
-        <w:t xml:space="preserve">get it done</w:t>
-      </w:r>
-      <w:r>
-        <w:t xml:space="preserve">’</w:t>
-      </w:r>
-      <w:r>
-        <w:t xml:space="preserve"> </w:t>
-      </w:r>
-      <w:r>
-        <w:t xml:space="preserve">drive to ship code, and goes above and beyond in making smart decisions that save time and improve the app experience. A perfect example of this is Michael’s initiative to take the original Khaki Pants Pete spec and see the opportunity to make the underlying iOS game engine more generic and flexible via a data-driven XML game file format that made adjusting the game play, settings, actions and visual experience very easy. This single innovation allowed us to ship on time with a great experience despite the multitude of late</w:t>
-      </w:r>
-      <w:r>
-        <w:t xml:space="preserve"> </w:t>
-      </w:r>
-      <w:r>
-        <w:t xml:space="preserve">‘</w:t>
-      </w:r>
-      <w:r>
-        <w:t xml:space="preserve">change requests</w:t>
-      </w:r>
-      <w:r>
-        <w:t xml:space="preserve">’</w:t>
-      </w:r>
-      <w:r>
-        <w:t xml:space="preserve"> </w:t>
-      </w:r>
-      <w:r>
-        <w:t xml:space="preserve">from the customer that so often occur in our industry. I can’t wait to work with him again!</w:t>
-      </w:r>
-      <w:r>
-        <w:t xml:space="preserve">”</w:t>
-      </w:r>
-    </w:p>
-    <w:p>
-      <w:pPr>
-        <w:numPr>
-          <w:ilvl w:val="0"/>
-          <w:numId w:val="1012"/>
-        </w:numPr>
-      </w:pPr>
-      <w:r>
-        <w:t xml:space="preserve">“</w:t>
-      </w:r>
-      <w:r>
-        <w:t xml:space="preserve">Also, in keeping with Mike Kramlich’s design goal of keeping the game simple and focused on the combat, you don’t design your ships a la Space Empires IV or develop your technology tees as per Master of Orion, Reach for the Stars, and Space Empires IV. You collect money, you build ships, you move, and you have combat. It’s pretty simple in execution—more chess than Sid Meier’s Civilization. It is more like the table-top marble game Albedo than Othello or Go. Movement is important, but it is restricted enough that grand flanking movements aren’t likely. If you can maintain your front lines and make sure you have enough reserves to cover a potential breakthrough, you can keep pushing forward by taking a few systems each turn.</w:t>
-      </w:r>
-      <w:r>
-        <w:t xml:space="preserve">”</w:t>
-      </w:r>
-      <w:r>
-        <w:t xml:space="preserve"> </w:t>
-      </w:r>
-      <w:r>
-        <w:t xml:space="preserve">– by Johnny Wilson (ex editor of Computer Gaming World), in his preview of my game Shattered Stars, back when I ran ZodLogic Games and he was part of Manifesto Games</w:t>
-      </w:r>
-    </w:p>
-    <w:p>
-      <w:pPr>
-        <w:numPr>
-          <w:ilvl w:val="0"/>
-          <w:numId w:val="1012"/>
-        </w:numPr>
-      </w:pPr>
-      <w:r>
-        <w:t xml:space="preserve">“</w:t>
-      </w:r>
-      <w:r>
-        <w:t xml:space="preserve">Badass! Great job</w:t>
-      </w:r>
-      <w:r>
-        <w:t xml:space="preserve">”</w:t>
-      </w:r>
-      <w:r>
-        <w:t xml:space="preserve"> </w:t>
-      </w:r>
-      <w:r>
-        <w:t xml:space="preserve">- a founding CEO in EV recharging industry</w:t>
-      </w:r>
-    </w:p>
-    <w:bookmarkEnd w:id="75"/>
-    <w:bookmarkStart w:id="76" w:name="culture-policies"/>
+    <w:bookmarkStart w:id="75" w:name="culture-policies"/>
     <w:p>
       <w:pPr>
         <w:pStyle w:val="Heading1"/>
@@ -3630,54 +3604,54 @@
         <w:t xml:space="preserve">NO JERKS. related: NO PARANOID bosses/employers, or, gaslighters</w:t>
       </w:r>
     </w:p>
+    <w:bookmarkEnd w:id="75"/>
+    <w:bookmarkStart w:id="76" w:name="misc"/>
+    <w:p>
+      <w:pPr>
+        <w:pStyle w:val="Heading1"/>
+      </w:pPr>
+      <w:r>
+        <w:t xml:space="preserve">Misc</w:t>
+      </w:r>
+    </w:p>
+    <w:p>
+      <w:pPr>
+        <w:numPr>
+          <w:ilvl w:val="0"/>
+          <w:numId w:val="1014"/>
+        </w:numPr>
+        <w:pStyle w:val="Compact"/>
+      </w:pPr>
+      <w:r>
+        <w:t xml:space="preserve">US citizen &amp; resident</w:t>
+      </w:r>
+    </w:p>
+    <w:p>
+      <w:pPr>
+        <w:numPr>
+          <w:ilvl w:val="0"/>
+          <w:numId w:val="1014"/>
+        </w:numPr>
+        <w:pStyle w:val="Compact"/>
+      </w:pPr>
+      <w:r>
+        <w:t xml:space="preserve">US English native speaker (weak/rusty French &amp; German)</w:t>
+      </w:r>
+    </w:p>
+    <w:p>
+      <w:pPr>
+        <w:numPr>
+          <w:ilvl w:val="0"/>
+          <w:numId w:val="1014"/>
+        </w:numPr>
+        <w:pStyle w:val="Compact"/>
+      </w:pPr>
+      <w:r>
+        <w:t xml:space="preserve">hobbies: gaming; wargaming; LEGO; watching football; reading sci-fi &amp; history; writing comedy; long walks/hikes for cardio exercise &amp; boosting endurance health</w:t>
+      </w:r>
+    </w:p>
     <w:bookmarkEnd w:id="76"/>
-    <w:bookmarkStart w:id="77" w:name="misc"/>
-    <w:p>
-      <w:pPr>
-        <w:pStyle w:val="Heading1"/>
-      </w:pPr>
-      <w:r>
-        <w:t xml:space="preserve">Misc</w:t>
-      </w:r>
-    </w:p>
-    <w:p>
-      <w:pPr>
-        <w:numPr>
-          <w:ilvl w:val="0"/>
-          <w:numId w:val="1014"/>
-        </w:numPr>
-        <w:pStyle w:val="Compact"/>
-      </w:pPr>
-      <w:r>
-        <w:t xml:space="preserve">US citizen &amp; resident</w:t>
-      </w:r>
-    </w:p>
-    <w:p>
-      <w:pPr>
-        <w:numPr>
-          <w:ilvl w:val="0"/>
-          <w:numId w:val="1014"/>
-        </w:numPr>
-        <w:pStyle w:val="Compact"/>
-      </w:pPr>
-      <w:r>
-        <w:t xml:space="preserve">US English native speaker (weak/rusty French &amp; German)</w:t>
-      </w:r>
-    </w:p>
-    <w:p>
-      <w:pPr>
-        <w:numPr>
-          <w:ilvl w:val="0"/>
-          <w:numId w:val="1014"/>
-        </w:numPr>
-        <w:pStyle w:val="Compact"/>
-      </w:pPr>
-      <w:r>
-        <w:t xml:space="preserve">hobbies: gaming; wargaming; LEGO; watching football; reading sci-fi &amp; history; writing comedy; long walks/hikes for cardio exercise &amp; boosting endurance health</w:t>
-      </w:r>
-    </w:p>
-    <w:bookmarkEnd w:id="77"/>
-    <w:bookmarkStart w:id="82" w:name="online-presence"/>
+    <w:bookmarkStart w:id="81" w:name="online-presence"/>
     <w:p>
       <w:pPr>
         <w:pStyle w:val="Heading1"/>
@@ -3704,7 +3678,7 @@
       <w:r>
         <w:t xml:space="preserve"> </w:t>
       </w:r>
-      <w:hyperlink r:id="rId78">
+      <w:hyperlink r:id="rId77">
         <w:r>
           <w:rPr>
             <w:rStyle w:val="Hyperlink"/>
@@ -3758,7 +3732,7 @@
       <w:r>
         <w:t xml:space="preserve"> </w:t>
       </w:r>
-      <w:hyperlink r:id="rId79">
+      <w:hyperlink r:id="rId78">
         <w:r>
           <w:rPr>
             <w:rStyle w:val="Hyperlink"/>
@@ -3785,7 +3759,7 @@
       <w:r>
         <w:t xml:space="preserve"> </w:t>
       </w:r>
-      <w:hyperlink r:id="rId80">
+      <w:hyperlink r:id="rId79">
         <w:r>
           <w:rPr>
             <w:rStyle w:val="Hyperlink"/>
@@ -3812,7 +3786,7 @@
       <w:r>
         <w:t xml:space="preserve"> </w:t>
       </w:r>
-      <w:hyperlink r:id="rId81">
+      <w:hyperlink r:id="rId80">
         <w:r>
           <w:rPr>
             <w:rStyle w:val="Hyperlink"/>
@@ -3826,10 +3800,10 @@
         <w:pStyle w:val="FirstParagraph"/>
       </w:pPr>
       <w:r>
-        <w:t xml:space="preserve">UPDATED: 2026 Jun 24</w:t>
-      </w:r>
-    </w:p>
-    <w:bookmarkEnd w:id="82"/>
+        <w:t xml:space="preserve">UPDATED: 2026 Jun 29</w:t>
+      </w:r>
+    </w:p>
+    <w:bookmarkEnd w:id="81"/>
     <w:sectPr/>
   </w:body>
 </w:document>

</xml_diff>

<commit_message>
LatLearn: tweaked blurb (to add mention of modes, p50, p99, p999 and share fraction to its list of latency sampling statistic features)
</commit_message>
<xml_diff>
--- a/sw-eng-MikeKramlich.docx
+++ b/sw-eng-MikeKramlich.docx
@@ -23,7 +23,7 @@
         <w:pStyle w:val="Date"/>
       </w:pPr>
       <w:r>
-        <w:t xml:space="preserve">2026 Jun 29</w:t>
+        <w:t xml:space="preserve">2026 Jul 22</w:t>
       </w:r>
     </w:p>
     <w:bookmarkStart w:id="20" w:name="introduction"/>
@@ -663,7 +663,7 @@
         <w:br/>
       </w:r>
       <w:r>
-        <w:t xml:space="preserve">latency perf instrumentation &amp; reporting lib for Golang (as FOSS). Nanosecond scale measurements. Stat calcs for each named span, across set of all samples: min, max, last, mean, weight, cumul. Report file gen (in plain text so VCS friendly, enough structure for parsing.) Option to run common benchmarks of interest. Host &amp; runtime config probe, added to reports. Overhead self-sampling, and option to auto-compensate in reported values. Variant span families: metric groups that vary only by task param values, environmental conditions or alternate flow paths or function exits. Concurrent &amp; thread-safe by design. Plays well with Contexts, defer and panic. This lib provides features Golang does not out-of-the-box, and neither do generic/lang-agnostic system tools or profilers. Transparent and makes no</w:t>
+        <w:t xml:space="preserve">latency perf instrumentation &amp; reporting lib for Golang (as FOSS). Nanosecond scale measurements. Stat calcs for each named span, across set of all samples: min, max, last, mean, modes, p50, p99, p999, weight, cumul, share fraction. Report file gen (in plain text so VCS friendly, enough structure for parsing.) Option to run common benchmarks of interest. Host &amp; runtime config probe, added to reports. Overhead self-sampling, and option to auto-compensate in reported values. Variant span families: metric groups that vary only by task param values, environmental conditions or alternate flow paths or function exits. Concurrent &amp; thread-safe by design. Plays well with Contexts, defer and panic. This lib provides features Golang does not out-of-the-box, and neither do generic/lang-agnostic system tools or profilers. Transparent and makes no</w:t>
       </w:r>
       <w:r>
         <w:t xml:space="preserve"> </w:t>
@@ -3800,7 +3800,7 @@
         <w:pStyle w:val="FirstParagraph"/>
       </w:pPr>
       <w:r>
-        <w:t xml:space="preserve">UPDATED: 2026 Jun 29</w:t>
+        <w:t xml:space="preserve">UPDATED: 2026 Jul 22</w:t>
       </w:r>
     </w:p>
     <w:bookmarkEnd w:id="81"/>

</xml_diff>